<commit_message>
Fix Drive note exports and client folders
</commit_message>
<xml_diff>
--- a/assets/templates/TEMPLATE.docx
+++ b/assets/templates/TEMPLATE.docx
@@ -306,6 +306,23 @@
           <w:sz w:val="24"/>
           <w:szCs w:val="24"/>
         </w:rPr>
+      </w:r>
+    </w:p>
+    <w:p>
+      <w:pPr>
+        <w:pStyle w:val="Normal"/>
+        <w:rPr>
+          <w:sz w:val="24"/>
+          <w:szCs w:val="24"/>
+          <w:u w:val="double"/>
+        </w:rPr>
+      </w:pPr>
+      <w:r>
+        <w:rPr>
+          <w:sz w:val="24"/>
+          <w:szCs w:val="24"/>
+        </w:rPr>
+        <w:t>Next actions  Max. 150 words)`</w:t>
       </w:r>
     </w:p>
     <w:p>
@@ -1380,8 +1397,8 @@
     <w:qFormat/>
     <w:rPr/>
   </w:style>
-  <w:style w:type="character" w:styleId="Bullets">
-    <w:name w:val="Bullets"/>
+  <w:style w:type="character" w:styleId="Bulletsuser">
+    <w:name w:val="Bullets (user)"/>
     <w:qFormat/>
     <w:rPr>
       <w:rFonts w:ascii="OpenSymbol" w:hAnsi="OpenSymbol" w:eastAsia="OpenSymbol" w:cs="OpenSymbol"/>

</xml_diff>